<commit_message>
Refine Section 8: distinguish major-arc (zeta-growth) vs minor-arc (Weyl/large-sieve) toolkits; add Vaughan and Parsell references
</commit_message>
<xml_diff>
--- a/paper/Goldbach_Sieve_Density_Framework.docx
+++ b/paper/Goldbach_Sieve_Density_Framework.docx
@@ -96,7 +96,7 @@
           <w:i w:val="false"/>
           <w:iCs w:val="false"/>
         </w:rPr>
-        <w:t xml:space="preserve">This revision (Version B) extends that base with a second track: an explicit circle-method decomposition of the Goldbach representation count into a major-arc term and an error term, formalized independently of the original Analytic Bridge. Within that decomposition we isolate a strict minor-arc dominance hypothesis, then narrow it to two concrete, named sub-hypotheses shaped after classical Euler–Maclaurin and zeta-growth techniques. One of those two sub-hypotheses — a real-analysis growth comparison — is now fully discharged unconditionally in Lean. What remains open collapses to a single, precisely stated hypothesis (a per-integer polynomial bound on the circle-method error term), together with a small residual gap covering finitely many small n. We ground this narrowed gap explicitly against Whittaker and Watson's classical treatment of residue calculus (Ch. VI), infinite-series and product expansions (Ch. VII), and the Riemann zeta function (Ch. XIII), and report a striking structural finding: our singularSeries construction is not merely analogous to the Weierstrass factor theorem (§7.5) and Euler's product for ζ(s) (§13.3) — it is a worked instance of the same architecture, already exploited unconditionally in two proven theorems.</w:t>
+        <w:t xml:space="preserve">This revision (Version B) extends that base with a second track: an explicit circle-method decomposition of the Goldbach representation count into a major-arc term and an error term, formalized independently of the original Analytic Bridge. Within that decomposition we isolate a strict minor-arc dominance hypothesis, then narrow it to two concrete, named sub-hypotheses. One of those two sub-hypotheses — a real-analysis growth comparison motivated by classical zeta-growth technique — is now fully discharged unconditionally in Lean. What remains open collapses to a single, precisely stated hypothesis (a per-integer polynomial bound on the circle-method error term), together with a small residual gap covering finitely many small n. We ground this narrowed gap explicitly against Whittaker and Watson's classical treatment of residue calculus (Ch. VI), infinite-series and product expansions (Ch. VII), and the Riemann zeta function (Ch. XIII), and, cross-checking against Vaughan's standard reference on the Hardy-Littlewood method, sharpen the claim considerably: zeta-growth technique closes the major-arc half of the picture, while the minor-arc bound the open hypothesis actually needs is a distinct classical problem, properly the province of Weyl-differencing and large-sieve exponential-sum estimates rather than zeta growth. We also report a striking structural finding along the way: our singularSeries construction is not merely analogous to the Weierstrass factor theorem (§7.5) and Euler's product for ζ(s) (§13.3) — it is a worked instance of the same architecture, already exploited unconditionally in two proven theorems.</w:t>
       </w:r>
     </w:p>
     <w:p>
@@ -309,7 +309,7 @@
           <w:i w:val="false"/>
           <w:iCs w:val="false"/>
         </w:rPr>
-        <w:t xml:space="preserve">This paper does not claim to resolve that gap. Its contribution is narrower and, we believe, more defensible: a fully machine-checked Lean 4 formalization of a sieve-density heuristic for Goldbach representations, together with a precise, formally-stated isolation of exactly where the unresolved mathematics lives — and, new to this revision, a second formal track that decomposes that gap further via the classical circle method, narrowing it to a single named hypothesis grounded explicitly in Euler–Maclaurin and zeta-growth theory.</w:t>
+        <w:t xml:space="preserve">This paper does not claim to resolve that gap. Its contribution is narrower and, we believe, more defensible: a fully machine-checked Lean 4 formalization of a sieve-density heuristic for Goldbach representations, together with a precise, formally-stated isolation of exactly where the unresolved mathematics lives — and, new to this revision, a second formal track that decomposes that gap further via the classical circle method, narrowing it to a single named hypothesis, and identifying precisely which classical toolkit (major-arc zeta-growth technique, versus minor-arc Weyl/large-sieve technique) that hypothesis actually falls under.</w:t>
       </w:r>
     </w:p>
     <w:p>
@@ -807,7 +807,7 @@
           <w:i w:val="false"/>
           <w:iCs w:val="false"/>
         </w:rPr>
-        <w:t xml:space="preserve">The best unconditional results toward bounding the circle-method error term for binary Goldbach bound the size of the exceptional set, not the error at a specific integer: Montgomery and Vaughan (1975, Acta Arithmetica 27) established E(x) ≪ x^(1−δ) for some δ &gt; 0 — i.e., almost all even n satisfy Goldbach with power-saving exceptions — subsequently improved by Chen and Liu (1989, E(X) = O(X^0.709)) and a later Pintz preprint (δ = 0.28). Hardy and Littlewood's original conditional bound (1923, assuming the Generalized Riemann Hypothesis) gives E(x) ≪ x^(1/2+ε). ErrorTermPolynomialBound as stated in this paper — a per-n bound with no exceptions, holding for every n ≥ 8 — is a strictly stronger, still fully open demand than the best published unconditional theorem in this area.</w:t>
+        <w:t xml:space="preserve">The best unconditional results toward bounding the circle-method error term for binary Goldbach bound the size of the exceptional set, not the error at a specific integer: Montgomery and Vaughan (1975, Acta Arithmetica 27) established E(x) ≪ x^(1−δ) for some δ &gt; 0 — i.e., almost all even n satisfy Goldbach with power-saving exceptions — subsequently improved by Chen and Liu (1989, E(X) = O(X^0.709)) and a later Pintz preprint (δ = 0.28). Hardy and Littlewood's original conditional bound (1923, assuming the Generalized Riemann Hypothesis) gives E(x) ≪ x^(1/2+ε). ErrorTermPolynomialBound as stated in this paper — a per-n bound with no exceptions, holding for every n ≥ 8 — is a strictly stronger, still fully open demand than the best published unconditional theorem in this area. Consistent with Section 8.4's toolkit distinction, Montgomery–Vaughan-type results are themselves proved via Weyl-differencing and large-sieve exponential-sum technique, not via zeta-growth bounds — further evidence that closing ErrorTermPolynomialBound, were it possible at all, would require sharpening that specific toolkit rather than the classical analysis surveyed in Section 8.</w:t>
       </w:r>
     </w:p>
     <w:p>
@@ -1341,7 +1341,22 @@
           <w:i w:val="false"/>
           <w:iCs w:val="false"/>
         </w:rPr>
-        <w:t xml:space="preserve">The three handoffs, read together, are the paper's actual claim: the classical toolkit reaches all the way to the boundary of the open problem — two of three specializations close completely and unconditionally — and stops at a single, named, precisely-stated point, rather than trailing off into vague heuristics. We regard identifying exactly where the classical rigor stops, rather than merely gesturing at Goldbach's general difficulty, as the paper's most useful contribution to a reader trying to decide where new analytic work would need to begin.</w:t>
+        <w:t xml:space="preserve">A precise refinement, worth stating plainly: the zeta-growth-bound family (Equation 12, §13.5–13.51) is naturally suited to major-arc precision, not directly to minor-arc bounding. This is confirmed by Vaughan's own textbook structure — The Hardy–Littlewood Method devotes an explicit zero-density estimate and zero-free region (analogues of Equation 12) to sharpening the major-arc approximation to ψ(x), while the minor arcs, in every worked treatment we examined, are closed by a categorically different tool: Weyl differencing and continued-fraction denominator estimates (Vaughan 1974, Diophantine approximation by prime numbers I), combined with large-sieve mean-value bounds. Parsell's 2003 treatment of a related Davenport–Heilbronn variant (primes plus powers of two) makes this split explicit and machine-checkable line by line: his major-arc analysis (§3) uses a zero-density estimate and zero-free region in exactly the Chapter XIII style, while his minor-arc bound (§5) uses a Weyl-type estimate via continued fractions (his Lemma 4, citing Vaughan) and a large-sieve mean-value estimate adapting Heath-Brown and Puchta (his Lemma 3) — no zeta zeros appear anywhere in that half of his argument. The upshot for this paper: Euler–Maclaurin and zeta-growth technique (Handoff 3 above) motivate the shape ErrorTermPolynomialBound anticipates and would very plausibly enter a major-arc refinement of MajorArcTerm, but the minor-arc bound itself — the actual content of ErrorTermPolynomialBound — falls to Weyl/Vaughan-type exponential-sum estimates, a distinct classical toolkit not covered by Whittaker &amp; Watson at all. We note, too, that Vaughan's own table of contents is a small but striking piece of structural evidence for the asymmetry already documented via Hardy–Littlewood 1922 and W&amp;W §13.31: the ternary Goldbach problem receives an initial six-page treatment (§3.1, pp. 27–32) plus a full second, twenty-page treatment (Chapter 8, pp. 127–146), while the binary problem — the case this paper's formalization addresses — is treated in four pages (§3.2, pp. 33–36) and left there. The disparity in how much the standard reference has to say about each case is itself a fair proxy for how much further the minor-arc method reaches in one case than the other.</w:t>
+      </w:r>
+    </w:p>
+    <w:p>
+      <w:pPr>
+        <w:spacing w:after="160"/>
+        <w:jc w:val="left"/>
+      </w:pPr>
+      <w:r>
+        <w:rPr>
+          <w:b w:val="false"/>
+          <w:bCs w:val="false"/>
+          <w:i w:val="false"/>
+          <w:iCs w:val="false"/>
+        </w:rPr>
+        <w:t xml:space="preserve">The three handoffs, read together with the major-arc/minor-arc distinction above, are the paper's actual claim: the classical toolkit reaches all the way to the boundary of the open problem — two of three specializations close completely and unconditionally, and the third is now understood to require a specific, correctly-identified toolkit (Weyl/Vaughan-type minor-arc estimates, not zeta-growth technique) rather than trailing off into vague heuristics. We regard identifying exactly where the classical rigor stops, and exactly which classical tool would need to close it, as the paper's most useful contribution to a reader trying to decide where new analytic work would need to begin.</w:t>
       </w:r>
     </w:p>
     <w:p>
@@ -1525,6 +1540,36 @@
           <w:iCs w:val="false"/>
         </w:rPr>
         <w:t xml:space="preserve">[9] E. T. Whittaker and G. N. Watson, A Course of Modern Analysis: An Introduction to the General Theory of Infinite Processes and of Analytic Functions; with an Account of the Principal Transcendental Functions, 4th ed., Cambridge University Press, 1963 (reprint). Chapters VI (§§6.1–6.4, pp. 111–121), VII (§§7.1–7.82, pp. 125–148), and XIII (§§13.2–13.6, pp. 269–279).</w:t>
+      </w:r>
+    </w:p>
+    <w:p>
+      <w:pPr>
+        <w:spacing w:after="160"/>
+        <w:jc w:val="left"/>
+      </w:pPr>
+      <w:r>
+        <w:rPr>
+          <w:b w:val="false"/>
+          <w:bCs w:val="false"/>
+          <w:i w:val="false"/>
+          <w:iCs w:val="false"/>
+        </w:rPr>
+        <w:t xml:space="preserve">[10] R. C. Vaughan, The Hardy–Littlewood Method, 2nd ed., Cambridge Tracts in Mathematics 125, Cambridge University Press, 1997. Chapter 3, "Goldbach's problems" (§3.1 The ternary Goldbach problem, pp. 27–32; §3.2 The binary Goldbach problem, pp. 33–36); Chapter 6, "Davenport's methods" (pp. 94–110); Chapter 8, "A ternary additive problem" (pp. 127–146).</w:t>
+      </w:r>
+    </w:p>
+    <w:p>
+      <w:pPr>
+        <w:spacing w:after="160"/>
+        <w:jc w:val="left"/>
+      </w:pPr>
+      <w:r>
+        <w:rPr>
+          <w:b w:val="false"/>
+          <w:bCs w:val="false"/>
+          <w:i w:val="false"/>
+          <w:iCs w:val="false"/>
+        </w:rPr>
+        <w:t xml:space="preserve">[11] S. T. Parsell, Diophantine approximation with primes and powers of two, New York J. Math. 9 (2003), 363–371.</w:t>
       </w:r>
     </w:p>
     <w:p>

</xml_diff>